<commit_message>
applied pointwise fit diagnostics - added to supp and ms
</commit_message>
<xml_diff>
--- a/docs/output/wet.docx
+++ b/docs/output/wet.docx
@@ -37,7 +37,13 @@
         <w:t xml:space="preserve"> </w:t>
       </w:r>
       <w:r>
-        <w:t xml:space="preserve">Anxiety:</w:t>
+        <w:t xml:space="preserve">Anxiety</w:t>
+      </w:r>
+      <w:r>
+        <w:t xml:space="preserve"> </w:t>
+      </w:r>
+      <w:r>
+        <w:t xml:space="preserve">Symptoms:</w:t>
       </w:r>
       <w:r>
         <w:t xml:space="preserve"> </w:t>
@@ -252,7 +258,7 @@
         <w:pStyle w:val="h1-pagebreak"/>
       </w:pPr>
       <w:r>
-        <w:t xml:space="preserve">Written Exposure Therapy for Transdiagnostic Anxiety: Treatment Efficacy and Mechanisms of Change</w:t>
+        <w:t xml:space="preserve">Written Exposure Therapy for Transdiagnostic Anxiety Symptoms: Treatment Efficacy and Mechanisms of Change</w:t>
       </w:r>
     </w:p>
     <w:p>
@@ -1995,26 +2001,6 @@
         <w:t xml:space="preserve"> </w:t>
       </w:r>
       <w:r>
-        <w:t xml:space="preserve">Two independent judges classified each four-wave exercise as either core-threat engaged or not engaged, based on whether at least one wave explicitly and emotionally engaged the participant’s pre-identified core threat.</w:t>
-      </w:r>
-      <w:r>
-        <w:t xml:space="preserve"> </w:t>
-      </w:r>
-      <w:r>
-        <w:t xml:space="preserve">Coding followed a conservative, binary decision rule to minimize inference and maximize inter-rater reliability.</w:t>
-      </w:r>
-    </w:p>
-    <w:p>
-      <w:pPr>
-        <w:pStyle w:val="Textkrper"/>
-      </w:pPr>
-      <w:r>
-        <w:t xml:space="preserve">Following reviewer feedback, we conducted a manualized content-coding procedure to assess core-threat engagement in the writing exercises.</w:t>
-      </w:r>
-      <w:r>
-        <w:t xml:space="preserve"> </w:t>
-      </w:r>
-      <w:r>
         <w:t xml:space="preserve">Two independent judges classified each participant’s four-wave exercise set as either</w:t>
       </w:r>
       <w:r>
@@ -2044,37 +2030,19 @@
         <w:t xml:space="preserve">not engaged</w:t>
       </w:r>
       <w:r>
-        <w:t xml:space="preserve">, using a conservative binary rule: participants were coded as engaged if at least one wave explicitly and emotionally addressed their pre-identified core threat.</w:t>
-      </w:r>
-      <w:r>
-        <w:t xml:space="preserve"> </w:t>
-      </w:r>
-      <w:r>
-        <w:t xml:space="preserve">The coding manual emphasized low-inference decisions (see supplementary materials).</w:t>
-      </w:r>
-      <w:r>
-        <w:t xml:space="preserve"> </w:t>
-      </w:r>
-      <w:r>
-        <w:t xml:space="preserve">All participants were coded by the first judge.</w:t>
-      </w:r>
-      <w:r>
-        <w:t xml:space="preserve"> </w:t>
-      </w:r>
-      <w:r>
-        <w:t xml:space="preserve">To evaluate reliability, a random subset of 20 participants (40%) was independently coded by the second judge.</w:t>
+        <w:t xml:space="preserve">, using a conservative binary rule: participants were coded as engaged if at least one wave explicitly and emotionally addressed their pre-identified core threat (see supplementary materials).</w:t>
+      </w:r>
+      <w:r>
+        <w:t xml:space="preserve"> </w:t>
+      </w:r>
+      <w:r>
+        <w:t xml:space="preserve">All participants were coded by the first judge, and a random subset of 20 participants (40%) was independently coded by the second judge to evaluate inter-rater reliability.</w:t>
       </w:r>
       <w:r>
         <w:t xml:space="preserve"> </w:t>
       </w:r>
       <w:r>
         <w:t xml:space="preserve">Inter-rater agreement was substantial (Cohen’s κ = 0.70, 95% CI [0.40, 1.00], 85.7% agreement).</w:t>
-      </w:r>
-      <w:r>
-        <w:t xml:space="preserve"> </w:t>
-      </w:r>
-      <w:r>
-        <w:t xml:space="preserve">Disagreements were resolved by discussion prior to analysis, and the consensus codes were used in all analyses.</w:t>
       </w:r>
     </w:p>
     <w:bookmarkEnd w:id="29"/>
@@ -2084,10 +2052,6 @@
         <w:pStyle w:val="berschrift2"/>
       </w:pPr>
       <w:r>
-        <w:rPr>
-          <w:bCs/>
-          <w:b/>
-        </w:rPr>
         <w:t xml:space="preserve">Procedure</w:t>
       </w:r>
     </w:p>
@@ -6364,7 +6328,7 @@
         <w:pStyle w:val="FirstParagraph"/>
       </w:pPr>
       <w:r>
-        <w:t xml:space="preserve">Most (n = NA, NA%) of the participants who completed WET were classified as having engaged with their identified core threat at least once across the four writing sessions.</w:t>
+        <w:t xml:space="preserve">Most (n = 33, 66.0%) of the participants who completed WET were classified as having engaged with their identified core threat at least once across the four writing sessions.</w:t>
       </w:r>
       <w:r>
         <w:t xml:space="preserve"> </w:t>
@@ -6450,7 +6414,7 @@
         <w:t xml:space="preserve"> </w:t>
       </w:r>
       <w:r>
-        <w:t xml:space="preserve">A modest advanage was observed for engagers at the one-week follow-up (</w:t>
+        <w:t xml:space="preserve">A modest advantage was observed for engagers at the one-week follow-up (</w:t>
       </w:r>
       <w:r>
         <w:rPr>
@@ -9526,7 +9490,7 @@
         <w:pStyle w:val="FirstParagraph"/>
       </w:pPr>
       <w:r>
-        <w:t xml:space="preserve">In the present study, most participants reported that the instructions were clear; a minority indicated difficulty understanding the instructions to return to the same script, which will be clarified in future versions.</w:t>
+        <w:t xml:space="preserve">In the present study, most participants reported that the instructions were clear; a minority indicated difficulty understanding the instructions to return to the same script.</w:t>
       </w:r>
       <w:r>
         <w:t xml:space="preserve"> </w:t>
@@ -10525,7 +10489,7 @@
         <w:pStyle w:val="FirstParagraph"/>
       </w:pPr>
       <w:r>
-        <w:t xml:space="preserve">Central to pathological fear is an inflated sense of threat, making perceived threat reduction key to alleviating anxiety</w:t>
+        <w:t xml:space="preserve">Central to pathological fear is an inflated sense of threat, making fear reduction key to alleviating anxiety</w:t>
       </w:r>
       <w:r>
         <w:t xml:space="preserve"> </w:t>

</xml_diff>